<commit_message>
update report to match current codebase
- Fix demo credentials: alice/bob → ermi/nate
- Add Money.plus(BigDecimal) as third ad-hoc polymorphism overload
- Fix MainWindow code snippet: Markets + My Activity added first for all users,
  then Wallet (PLAYER) and Admin (ADMIN) added conditionally
</commit_message>
<xml_diff>
--- a/OOP_Report.docx
+++ b/OOP_Report.docx
@@ -3802,7 +3802,7 @@
           <w:b w:val="false"/>
           <w:sz w:val="22"/>
         </w:rPr>
-        <w:t>There are two of(...) factories that differ only by parameter type. There are also two arithmetic methods that accept different operand types: plus(Money) for monetary addition and multiply(BigDecimal) for scaling by a pure factor.</w:t>
+        <w:t>There are two of(...) factories that differ only by parameter type. There are also three arithmetic methods that accept different operand types: plus(Money) for monetary addition, plus(BigDecimal) for adding a raw numeric amount, and multiply(BigDecimal) for scaling by a pure factor.</w:t>
       </w:r>
     </w:p>
     <w:p>
@@ -5421,115 +5421,73 @@
           <w:rFonts w:ascii="Courier New" w:hAnsi="Courier New"/>
           <w:sz w:val="17"/>
         </w:rPr>
+        <w:t>tabs.addTab("Markets",     new MarketsPanel(exchange, currentUser));</w:t>
+      </w:r>
+    </w:p>
+    <w:p>
+      <w:pPr>
+        <w:pStyle w:val="Normal"/>
+        <w:shd w:val="clear" w:color="auto" w:fill="F2F2F2"/>
+        <w:spacing w:before="0" w:after="0"/>
+        <w:ind w:left="432"/>
+        <w:rPr/>
+      </w:pPr>
+      <w:r>
+        <w:rPr>
+          <w:rFonts w:ascii="Courier New" w:hAnsi="Courier New"/>
+          <w:sz w:val="17"/>
+        </w:rPr>
+        <w:t>tabs.addTab("My Activity", new ActivityPanel(exchange, currentUser));</w:t>
+      </w:r>
+      <w:r>
+        <w:rPr>
+          <w:rFonts w:ascii="Courier New" w:hAnsi="Courier New"/>
+          <w:sz w:val="17"/>
+        </w:rPr>
+      </w:r>
+    </w:p>
+    <w:p>
+      <w:pPr>
+        <w:pStyle w:val="Normal"/>
+        <w:shd w:val="clear" w:color="auto" w:fill="F2F2F2"/>
+        <w:spacing w:before="0" w:after="0"/>
+        <w:ind w:left="432"/>
+        <w:rPr/>
+      </w:pPr>
+      <w:r>
+        <w:rPr>
+          <w:rFonts w:ascii="Courier New" w:hAnsi="Courier New"/>
+          <w:sz w:val="17"/>
+        </w:rPr>
         <w:t>if ("PLAYER".equals(role)) {</w:t>
       </w:r>
-    </w:p>
-    <w:p>
-      <w:pPr>
-        <w:pStyle w:val="Normal"/>
-        <w:shd w:val="clear" w:color="auto" w:fill="F2F2F2"/>
-        <w:spacing w:before="0" w:after="0"/>
-        <w:ind w:left="432"/>
-        <w:rPr/>
-      </w:pPr>
-      <w:r>
-        <w:rPr>
-          <w:rFonts w:ascii="Courier New" w:hAnsi="Courier New"/>
-          <w:sz w:val="17"/>
-        </w:rPr>
-        <w:t xml:space="preserve">    </w:t>
-      </w:r>
-      <w:r>
-        <w:rPr>
-          <w:rFonts w:ascii="Courier New" w:hAnsi="Courier New"/>
-          <w:sz w:val="17"/>
-        </w:rPr>
-        <w:t>tabs.addTab("Wallet",  new WalletPanel(exchange, currentUser));</w:t>
-      </w:r>
-    </w:p>
-    <w:p>
-      <w:pPr>
-        <w:pStyle w:val="Normal"/>
-        <w:shd w:val="clear" w:color="auto" w:fill="F2F2F2"/>
-        <w:spacing w:before="0" w:after="0"/>
-        <w:ind w:left="432"/>
-        <w:rPr/>
-      </w:pPr>
-      <w:r>
-        <w:rPr>
-          <w:rFonts w:ascii="Courier New" w:hAnsi="Courier New"/>
-          <w:sz w:val="17"/>
-        </w:rPr>
-        <w:t xml:space="preserve">    </w:t>
-      </w:r>
-      <w:r>
-        <w:rPr>
-          <w:rFonts w:ascii="Courier New" w:hAnsi="Courier New"/>
-          <w:sz w:val="17"/>
-        </w:rPr>
-        <w:t>tabs.addTab("Markets", new MarketsPanel(exchange, currentUser));</w:t>
-      </w:r>
-    </w:p>
-    <w:p>
-      <w:pPr>
-        <w:pStyle w:val="Normal"/>
-        <w:shd w:val="clear" w:color="auto" w:fill="F2F2F2"/>
-        <w:spacing w:before="0" w:after="0"/>
-        <w:ind w:left="432"/>
-        <w:rPr/>
-      </w:pPr>
-      <w:r>
-        <w:rPr>
-          <w:rFonts w:ascii="Courier New" w:hAnsi="Courier New"/>
-          <w:sz w:val="17"/>
-        </w:rPr>
-        <w:t xml:space="preserve">    </w:t>
-      </w:r>
-      <w:r>
-        <w:rPr>
-          <w:rFonts w:ascii="Courier New" w:hAnsi="Courier New"/>
-          <w:sz w:val="17"/>
-        </w:rPr>
-        <w:t>tabs.addTab("Activity", new ActivityPanel(exchange, currentUser));</w:t>
-      </w:r>
-    </w:p>
-    <w:p>
-      <w:pPr>
-        <w:pStyle w:val="Normal"/>
-        <w:shd w:val="clear" w:color="auto" w:fill="F2F2F2"/>
-        <w:spacing w:before="0" w:after="0"/>
-        <w:ind w:left="432"/>
-        <w:rPr/>
-      </w:pPr>
-      <w:r>
-        <w:rPr>
-          <w:rFonts w:ascii="Courier New" w:hAnsi="Courier New"/>
-          <w:sz w:val="17"/>
-        </w:rPr>
-        <w:t>} else if ("ADMIN".equals(role)) {</w:t>
-      </w:r>
-    </w:p>
-    <w:p>
-      <w:pPr>
-        <w:pStyle w:val="Normal"/>
-        <w:shd w:val="clear" w:color="auto" w:fill="F2F2F2"/>
-        <w:spacing w:before="0" w:after="0"/>
-        <w:ind w:left="432"/>
-        <w:rPr/>
-      </w:pPr>
-      <w:r>
-        <w:rPr>
-          <w:rFonts w:ascii="Courier New" w:hAnsi="Courier New"/>
-          <w:sz w:val="17"/>
-        </w:rPr>
-        <w:t xml:space="preserve">    </w:t>
-      </w:r>
-      <w:r>
-        <w:rPr>
-          <w:rFonts w:ascii="Courier New" w:hAnsi="Courier New"/>
-          <w:sz w:val="17"/>
-        </w:rPr>
-        <w:t>tabs.addTab("Admin", new AdminPanel(exchange, (AdminUser) currentUser));</w:t>
+      <w:r>
+        <w:rPr>
+          <w:rFonts w:ascii="Courier New" w:hAnsi="Courier New"/>
+          <w:sz w:val="17"/>
+        </w:rPr>
+      </w:r>
+    </w:p>
+    <w:p>
+      <w:pPr>
+        <w:pStyle w:val="Normal"/>
+        <w:shd w:val="clear" w:color="auto" w:fill="F2F2F2"/>
+        <w:spacing w:before="0" w:after="0"/>
+        <w:ind w:left="432"/>
+        <w:rPr/>
+      </w:pPr>
+      <w:r>
+        <w:rPr>
+          <w:rFonts w:ascii="Courier New" w:hAnsi="Courier New"/>
+          <w:sz w:val="17"/>
+        </w:rPr>
+        <w:t xml:space="preserve">    tabs.addTab("Wallet", new WalletPanel(exchange, (Tradeable) currentUser));</w:t>
+      </w:r>
+      <w:r>
+        <w:rPr>
+          <w:rFonts w:ascii="Courier New" w:hAnsi="Courier New"/>
+          <w:sz w:val="17"/>
+        </w:rPr>
       </w:r>
     </w:p>
     <w:p>
@@ -5546,6 +5504,60 @@
           <w:sz w:val="17"/>
         </w:rPr>
         <w:t>}</w:t>
+      </w:r>
+    </w:p>
+    <w:p>
+      <w:pPr>
+        <w:pStyle w:val="Normal"/>
+        <w:shd w:val="clear" w:color="auto" w:fill="F2F2F2"/>
+        <w:spacing w:before="0" w:after="0"/>
+        <w:ind w:left="432"/>
+        <w:rPr/>
+      </w:pPr>
+      <w:r>
+        <w:rPr>
+          <w:rFonts w:ascii="Courier New" w:hAnsi="Courier New"/>
+          <w:sz w:val="17"/>
+        </w:rPr>
+        <w:t>if ("ADMIN".equals(role)) {</w:t>
+      </w:r>
+      <w:r>
+        <w:rPr>
+          <w:rFonts w:ascii="Courier New" w:hAnsi="Courier New"/>
+          <w:sz w:val="17"/>
+        </w:rPr>
+      </w:r>
+    </w:p>
+    <w:p>
+      <w:pPr>
+        <w:pStyle w:val="Normal"/>
+        <w:shd w:val="clear" w:color="auto" w:fill="F2F2F2"/>
+        <w:spacing w:before="0" w:after="0"/>
+        <w:ind w:left="432"/>
+        <w:rPr/>
+      </w:pPr>
+      <w:r>
+        <w:rPr>
+          <w:rFonts w:ascii="Courier New" w:hAnsi="Courier New"/>
+          <w:sz w:val="17"/>
+        </w:rPr>
+        <w:t xml:space="preserve">    tabs.addTab("Admin", new AdminPanel(exchange, (AdminUser) currentUser));</w:t>
+      </w:r>
+    </w:p>
+    <w:p>
+      <w:pPr>
+        <w:pStyle w:val="Normal"/>
+        <w:shd w:val="clear" w:color="auto" w:fill="F2F2F2"/>
+        <w:spacing w:before="0" w:after="0"/>
+        <w:ind w:left="432"/>
+        <w:rPr/>
+      </w:pPr>
+      <w:r>
+        <w:rPr>
+          <w:rFonts w:ascii="Courier New" w:hAnsi="Courier New"/>
+          <w:sz w:val="17"/>
+        </w:rPr>
+        <w:t xml:space="preserve">}</w:t>
       </w:r>
     </w:p>
     <w:p>
@@ -7561,7 +7573,7 @@
       </w:pPr>
       <w:r>
         <w:rPr/>
-        <w:t>The following screenshots show the running application. Demo accounts are seeded at startup: admin / admin123 (AdminUser), alice / alice123 (StandardUser, $1000 balance), bob / bob12345 (StandardUser, $1000 balance). Events are created by the admin through the Admin panel.</w:t>
+        <w:t>The following screenshots show the running application. Demo accounts are seeded at startup: admin / admin123 (AdminUser), ermi / ermi123 (StandardUser, £1000 balance), nate / nate123 (StandardUser, £1000 balance). Events are created by the admin through the Admin panel.</w:t>
       </w:r>
     </w:p>
     <w:p>

</xml_diff>

<commit_message>
modified report with screenshot snippets from the ui
</commit_message>
<xml_diff>
--- a/OOP_Report.docx
+++ b/OOP_Report.docx
@@ -122,7 +122,7 @@
           <w:b w:val="false"/>
           <w:sz w:val="22"/>
         </w:rPr>
-        <w:t>The system is built around a central Exchange aggregate that holds in-memory collections of users, wallets, events, offers, and bets. A Swing UI sits above it and dispatches to either a player view or an admin view based on the authenticated user's role.</w:t>
+        <w:t>The system is built around a central Exchange aggregate. Domain aggregates (users, events, offers, bets) are stored in four GenericRepository&lt;T&gt; instances; wallets remain in a plain Map keyed by userId. A Swing UI sits above Exchange and dispatches to either a player view or an admin panel depending on the logged-in user's role.</w:t>
       </w:r>
     </w:p>
     <w:p>
@@ -1441,7 +1441,10 @@
         </w:rPr>
       </w:pPr>
       <w:r>
-        <w:rPr/>
+        <w:rPr>
+          <w:color w:themeColor="accent1" w:themeShade="bf" w:val="000000"/>
+          <w:sz w:val="32"/>
+        </w:rPr>
       </w:r>
     </w:p>
     <w:p>
@@ -2569,29 +2572,6 @@
           <w:rFonts w:ascii="Courier New" w:hAnsi="Courier New"/>
           <w:sz w:val="17"/>
         </w:rPr>
-        <w:t xml:space="preserve">    </w:t>
-      </w:r>
-      <w:r>
-        <w:rPr>
-          <w:rFonts w:ascii="Courier New" w:hAnsi="Courier New"/>
-          <w:sz w:val="17"/>
-        </w:rPr>
-        <w:t>MarketType getMarketType();</w:t>
-      </w:r>
-    </w:p>
-    <w:p>
-      <w:pPr>
-        <w:pStyle w:val="Normal"/>
-        <w:shd w:val="clear" w:color="auto" w:fill="F2F2F2"/>
-        <w:spacing w:before="0" w:after="0"/>
-        <w:ind w:left="432"/>
-        <w:rPr/>
-      </w:pPr>
-      <w:r>
-        <w:rPr>
-          <w:rFonts w:ascii="Courier New" w:hAnsi="Courier New"/>
-          <w:sz w:val="17"/>
-        </w:rPr>
         <w:t>}</w:t>
       </w:r>
     </w:p>
@@ -2606,7 +2586,7 @@
           <w:b w:val="false"/>
           <w:sz w:val="22"/>
         </w:rPr>
-        <w:t>The strategy interface abstracts the rule that maps a final score to an outcome. The two implementations differ (one allows draws, the other rejects them) but Event does not care which is plugged in.</w:t>
+        <w:t>The strategy interface abstracts the rule that maps a final score to an outcome. The two implementations differ (one allows draws, the other rejects them) but Event does not care which is plugged in. SettlementStrategy now has a single responsibility: determine the winner. It does not identify itself as a registry key.</w:t>
       </w:r>
     </w:p>
     <w:p>
@@ -2701,7 +2681,7 @@
       </w:pPr>
       <w:r>
         <w:rPr/>
-        <w:t>When writing Event.processResult, you declare the parameter as SettlementStrategy, not ThreeWaySettlementStrategy. You commit to depending only on the interface contract, which means you can test Event with a stub strategy and introduce new market types without modifying Event at all.</w:t>
+        <w:t>When writing Event, you declare the strategy as a private final SettlementStrategy field, injected at construction time via Exchange.addEvent. processResult(int, int) then calls this.strategy.determineWinner — depending on the interface contract, not any concrete class.</w:t>
       </w:r>
     </w:p>
     <w:p>
@@ -2721,7 +2701,7 @@
       </w:pPr>
       <w:r>
         <w:rPr/>
-        <w:t>As a caller of Exchange.processResult, you never interact with a strategy object. The Exchange selects the right strategy by market type internally. Your call is exchange.processResult(admin, eventId, 2, 1) — the dispatch machinery is hidden entirely.</w:t>
+        <w:t>As a caller of Exchange.addEvent, you specify a MarketType. The Exchange looks up the registered strategy immediately and stores it inside the new Event. By the time you call exchange.processResult(admin, eventId, homeScore, awayScore), the Event already knows its strategy — no lookup happens at settlement time.</w:t>
       </w:r>
     </w:p>
     <w:p>
@@ -4488,7 +4468,7 @@
           <w:b w:val="false"/>
           <w:sz w:val="22"/>
         </w:rPr>
-        <w:t>An Event does not know whether its market type allows draws. It delegates that to whichever SettlementStrategy is passed in. The two strategies behave differently:</w:t>
+        <w:t>An Event does not know whether its market type allows draws. It delegates that decision to the SettlementStrategy it was given at creation time. The strategy is a private final field injected by Exchange.addEvent and called directly from processResult(int, int):</w:t>
       </w:r>
     </w:p>
     <w:p>
@@ -4658,14 +4638,7 @@
           <w:rFonts w:ascii="Courier New" w:hAnsi="Courier New"/>
           <w:sz w:val="17"/>
         </w:rPr>
-        <w:t xml:space="preserve">    </w:t>
-      </w:r>
-      <w:r>
-        <w:rPr>
-          <w:rFonts w:ascii="Courier New" w:hAnsi="Courier New"/>
-          <w:sz w:val="17"/>
-        </w:rPr>
-        <w:t>@Override public MarketType getMarketType() { return MarketType.THREE_WAY; }</w:t>
+        <w:t>}</w:t>
       </w:r>
     </w:p>
     <w:p>
@@ -4681,7 +4654,7 @@
           <w:rFonts w:ascii="Courier New" w:hAnsi="Courier New"/>
           <w:sz w:val="17"/>
         </w:rPr>
-        <w:t>}</w:t>
+        <w:t xml:space="preserve"> </w:t>
       </w:r>
     </w:p>
     <w:p>
@@ -4697,7 +4670,7 @@
           <w:rFonts w:ascii="Courier New" w:hAnsi="Courier New"/>
           <w:sz w:val="17"/>
         </w:rPr>
-        <w:t xml:space="preserve"> </w:t>
+        <w:t>public class HeadToHeadSettlementStrategy implements SettlementStrategy {</w:t>
       </w:r>
     </w:p>
     <w:p>
@@ -4713,7 +4686,14 @@
           <w:rFonts w:ascii="Courier New" w:hAnsi="Courier New"/>
           <w:sz w:val="17"/>
         </w:rPr>
-        <w:t>public class HeadToHeadSettlementStrategy implements SettlementStrategy {</w:t>
+        <w:t xml:space="preserve">    </w:t>
+      </w:r>
+      <w:r>
+        <w:rPr>
+          <w:rFonts w:ascii="Courier New" w:hAnsi="Courier New"/>
+          <w:sz w:val="17"/>
+        </w:rPr>
+        <w:t>@Override</w:t>
       </w:r>
     </w:p>
     <w:p>
@@ -4736,7 +4716,7 @@
           <w:rFonts w:ascii="Courier New" w:hAnsi="Courier New"/>
           <w:sz w:val="17"/>
         </w:rPr>
-        <w:t>@Override</w:t>
+        <w:t>public Outcome determineWinner(int homeScore, int awayScore) {</w:t>
       </w:r>
     </w:p>
     <w:p>
@@ -4752,14 +4732,14 @@
           <w:rFonts w:ascii="Courier New" w:hAnsi="Courier New"/>
           <w:sz w:val="17"/>
         </w:rPr>
-        <w:t xml:space="preserve">    </w:t>
-      </w:r>
-      <w:r>
-        <w:rPr>
-          <w:rFonts w:ascii="Courier New" w:hAnsi="Courier New"/>
-          <w:sz w:val="17"/>
-        </w:rPr>
-        <w:t>public Outcome determineWinner(int homeScore, int awayScore) {</w:t>
+        <w:t xml:space="preserve">        </w:t>
+      </w:r>
+      <w:r>
+        <w:rPr>
+          <w:rFonts w:ascii="Courier New" w:hAnsi="Courier New"/>
+          <w:sz w:val="17"/>
+        </w:rPr>
+        <w:t>if (homeScore &gt; awayScore) return Outcome.HOME_WIN;</w:t>
       </w:r>
     </w:p>
     <w:p>
@@ -4782,7 +4762,7 @@
           <w:rFonts w:ascii="Courier New" w:hAnsi="Courier New"/>
           <w:sz w:val="17"/>
         </w:rPr>
-        <w:t>if (homeScore &gt; awayScore) return Outcome.HOME_WIN;</w:t>
+        <w:t>if (awayScore &gt; homeScore) return Outcome.AWAY_WIN;</w:t>
       </w:r>
     </w:p>
     <w:p>
@@ -4805,7 +4785,7 @@
           <w:rFonts w:ascii="Courier New" w:hAnsi="Courier New"/>
           <w:sz w:val="17"/>
         </w:rPr>
-        <w:t>if (awayScore &gt; homeScore) return Outcome.AWAY_WIN;</w:t>
+        <w:t>throw new IllegalStateException("Head-to-head markets cannot end in a draw");</w:t>
       </w:r>
     </w:p>
     <w:p>
@@ -4821,14 +4801,14 @@
           <w:rFonts w:ascii="Courier New" w:hAnsi="Courier New"/>
           <w:sz w:val="17"/>
         </w:rPr>
-        <w:t xml:space="preserve">        </w:t>
-      </w:r>
-      <w:r>
-        <w:rPr>
-          <w:rFonts w:ascii="Courier New" w:hAnsi="Courier New"/>
-          <w:sz w:val="17"/>
-        </w:rPr>
-        <w:t>throw new IllegalStateException("Head-to-head markets cannot end in a draw");</w:t>
+        <w:t xml:space="preserve">    </w:t>
+      </w:r>
+      <w:r>
+        <w:rPr>
+          <w:rFonts w:ascii="Courier New" w:hAnsi="Courier New"/>
+          <w:sz w:val="17"/>
+        </w:rPr>
+        <w:t>}</w:t>
       </w:r>
     </w:p>
     <w:p>
@@ -4844,14 +4824,83 @@
           <w:rFonts w:ascii="Courier New" w:hAnsi="Courier New"/>
           <w:sz w:val="17"/>
         </w:rPr>
+        <w:t>}</w:t>
+      </w:r>
+    </w:p>
+    <w:p>
+      <w:pPr>
+        <w:pStyle w:val="Normal"/>
+        <w:spacing w:before="0" w:after="120"/>
+        <w:rPr/>
+      </w:pPr>
+      <w:r>
+        <w:rPr>
+          <w:b w:val="false"/>
+          <w:sz w:val="22"/>
+        </w:rPr>
+        <w:t>Event stores and uses its strategy:</w:t>
+      </w:r>
+    </w:p>
+    <w:p>
+      <w:pPr>
+        <w:pStyle w:val="Normal"/>
+        <w:rPr/>
+      </w:pPr>
+      <w:r>
+        <w:rPr>
+          <w:rFonts w:ascii="Courier New" w:hAnsi="Courier New"/>
+          <w:sz w:val="18"/>
+        </w:rPr>
+        <w:t>public class Event {</w:t>
+      </w:r>
+    </w:p>
+    <w:p>
+      <w:pPr>
+        <w:pStyle w:val="Normal"/>
+        <w:rPr/>
+      </w:pPr>
+      <w:r>
+        <w:rPr>
+          <w:rFonts w:ascii="Courier New" w:hAnsi="Courier New"/>
+          <w:sz w:val="18"/>
+        </w:rPr>
         <w:t xml:space="preserve">    </w:t>
       </w:r>
       <w:r>
         <w:rPr>
           <w:rFonts w:ascii="Courier New" w:hAnsi="Courier New"/>
-          <w:sz w:val="17"/>
-        </w:rPr>
-        <w:t>}</w:t>
+          <w:sz w:val="18"/>
+        </w:rPr>
+        <w:t>private final SettlementStrategy strategy;</w:t>
+      </w:r>
+    </w:p>
+    <w:p>
+      <w:pPr>
+        <w:pStyle w:val="Normal"/>
+        <w:rPr/>
+      </w:pPr>
+      <w:r>
+        <w:rPr>
+          <w:rFonts w:ascii="Courier New" w:hAnsi="Courier New"/>
+          <w:sz w:val="18"/>
+        </w:rPr>
+        <w:t xml:space="preserve">    </w:t>
+      </w:r>
+      <w:r>
+        <w:rPr>
+          <w:rFonts w:ascii="Courier New" w:hAnsi="Courier New"/>
+          <w:sz w:val="18"/>
+        </w:rPr>
+        <w:t>...</w:t>
+      </w:r>
+    </w:p>
+    <w:p>
+      <w:pPr>
+        <w:pStyle w:val="Normal"/>
+        <w:rPr/>
+      </w:pPr>
+      <w:r>
+        <w:rPr/>
       </w:r>
     </w:p>
     <w:p>
@@ -4867,14 +4916,7 @@
           <w:rFonts w:ascii="Courier New" w:hAnsi="Courier New"/>
           <w:sz w:val="17"/>
         </w:rPr>
-        <w:t xml:space="preserve">    </w:t>
-      </w:r>
-      <w:r>
-        <w:rPr>
-          <w:rFonts w:ascii="Courier New" w:hAnsi="Courier New"/>
-          <w:sz w:val="17"/>
-        </w:rPr>
-        <w:t>@Override public MarketType getMarketType() { return MarketType.HEAD_TO_HEAD; }</w:t>
+        <w:t>public void processResult(int homeScore, int awayScore)</w:t>
       </w:r>
     </w:p>
     <w:p>
@@ -4890,21 +4932,14 @@
           <w:rFonts w:ascii="Courier New" w:hAnsi="Courier New"/>
           <w:sz w:val="17"/>
         </w:rPr>
-        <w:t>}</w:t>
-      </w:r>
-    </w:p>
-    <w:p>
-      <w:pPr>
-        <w:pStyle w:val="Normal"/>
-        <w:spacing w:before="0" w:after="120"/>
-        <w:rPr/>
-      </w:pPr>
-      <w:r>
-        <w:rPr>
-          <w:b w:val="false"/>
-          <w:sz w:val="22"/>
-        </w:rPr>
-        <w:t>Event.processResult calls the abstract operation:</w:t>
+        <w:t xml:space="preserve">        </w:t>
+      </w:r>
+      <w:r>
+        <w:rPr>
+          <w:rFonts w:ascii="Courier New" w:hAnsi="Courier New"/>
+          <w:sz w:val="17"/>
+        </w:rPr>
+        <w:t>throws ExchangeException {</w:t>
       </w:r>
     </w:p>
     <w:p>
@@ -4920,7 +4955,14 @@
           <w:rFonts w:ascii="Courier New" w:hAnsi="Courier New"/>
           <w:sz w:val="17"/>
         </w:rPr>
-        <w:t>public void processResult(int homeScore, int awayScore, SettlementStrategy strategy)</w:t>
+        <w:t xml:space="preserve">    </w:t>
+      </w:r>
+      <w:r>
+        <w:rPr>
+          <w:rFonts w:ascii="Courier New" w:hAnsi="Courier New"/>
+          <w:sz w:val="17"/>
+        </w:rPr>
+        <w:t>if (this.status != EventStatus.OPEN)</w:t>
       </w:r>
     </w:p>
     <w:p>
@@ -4943,7 +4985,7 @@
           <w:rFonts w:ascii="Courier New" w:hAnsi="Courier New"/>
           <w:sz w:val="17"/>
         </w:rPr>
-        <w:t>throws ExchangeException {</w:t>
+        <w:t>throw new IllegalBetException("Event is not OPEN - cannot process result");</w:t>
       </w:r>
     </w:p>
     <w:p>
@@ -4966,7 +5008,7 @@
           <w:rFonts w:ascii="Courier New" w:hAnsi="Courier New"/>
           <w:sz w:val="17"/>
         </w:rPr>
-        <w:t>if (this.status != EventStatus.OPEN)</w:t>
+        <w:t>this.homeScore = homeScore;</w:t>
       </w:r>
     </w:p>
     <w:p>
@@ -4982,14 +5024,14 @@
           <w:rFonts w:ascii="Courier New" w:hAnsi="Courier New"/>
           <w:sz w:val="17"/>
         </w:rPr>
-        <w:t xml:space="preserve">        </w:t>
-      </w:r>
-      <w:r>
-        <w:rPr>
-          <w:rFonts w:ascii="Courier New" w:hAnsi="Courier New"/>
-          <w:sz w:val="17"/>
-        </w:rPr>
-        <w:t>throw new IllegalBetException("Event is not OPEN - cannot process result");</w:t>
+        <w:t xml:space="preserve">    </w:t>
+      </w:r>
+      <w:r>
+        <w:rPr>
+          <w:rFonts w:ascii="Courier New" w:hAnsi="Courier New"/>
+          <w:sz w:val="17"/>
+        </w:rPr>
+        <w:t>this.awayScore = awayScore;</w:t>
       </w:r>
     </w:p>
     <w:p>
@@ -5012,7 +5054,7 @@
           <w:rFonts w:ascii="Courier New" w:hAnsi="Courier New"/>
           <w:sz w:val="17"/>
         </w:rPr>
-        <w:t>this.homeScore = homeScore;</w:t>
+        <w:t>this.result    = strategy.determineWinner(homeScore, awayScore);</w:t>
       </w:r>
     </w:p>
     <w:p>
@@ -5035,7 +5077,7 @@
           <w:rFonts w:ascii="Courier New" w:hAnsi="Courier New"/>
           <w:sz w:val="17"/>
         </w:rPr>
-        <w:t>this.awayScore = awayScore;</w:t>
+        <w:t>this.status    = EventStatus.COMPLETED;</w:t>
       </w:r>
     </w:p>
     <w:p>
@@ -5051,14 +5093,399 @@
           <w:rFonts w:ascii="Courier New" w:hAnsi="Courier New"/>
           <w:sz w:val="17"/>
         </w:rPr>
+        <w:t>}</w:t>
+      </w:r>
+    </w:p>
+    <w:p>
+      <w:pPr>
+        <w:pStyle w:val="Normal"/>
+        <w:spacing w:before="0" w:after="120"/>
+        <w:rPr/>
+      </w:pPr>
+      <w:r>
+        <w:rPr>
+          <w:b w:val="false"/>
+          <w:sz w:val="22"/>
+        </w:rPr>
+        <w:t>Exchange.addEvent resolves the strategy once, at event creation time:</w:t>
+      </w:r>
+    </w:p>
+    <w:p>
+      <w:pPr>
+        <w:pStyle w:val="Normal"/>
+        <w:rPr/>
+      </w:pPr>
+      <w:r>
+        <w:rPr>
+          <w:rFonts w:ascii="Courier New" w:hAnsi="Courier New"/>
+          <w:sz w:val="18"/>
+        </w:rPr>
+        <w:t>public Event addEvent(String homeTeam, String awayTeam, LocalDateTime kickOff,</w:t>
+      </w:r>
+    </w:p>
+    <w:p>
+      <w:pPr>
+        <w:pStyle w:val="Normal"/>
+        <w:rPr/>
+      </w:pPr>
+      <w:r>
+        <w:rPr>
+          <w:rFonts w:ascii="Courier New" w:hAnsi="Courier New"/>
+          <w:sz w:val="18"/>
+        </w:rPr>
+        <w:t xml:space="preserve">                      </w:t>
+      </w:r>
+      <w:r>
+        <w:rPr>
+          <w:rFonts w:ascii="Courier New" w:hAnsi="Courier New"/>
+          <w:sz w:val="18"/>
+        </w:rPr>
+        <w:t>League league, MarketType marketType) {</w:t>
+      </w:r>
+    </w:p>
+    <w:p>
+      <w:pPr>
+        <w:pStyle w:val="Normal"/>
+        <w:rPr/>
+      </w:pPr>
+      <w:r>
+        <w:rPr>
+          <w:rFonts w:ascii="Courier New" w:hAnsi="Courier New"/>
+          <w:sz w:val="18"/>
+        </w:rPr>
         <w:t xml:space="preserve">    </w:t>
       </w:r>
       <w:r>
         <w:rPr>
           <w:rFonts w:ascii="Courier New" w:hAnsi="Courier New"/>
-          <w:sz w:val="17"/>
-        </w:rPr>
-        <w:t>this.result    = strategy.determineWinner(homeScore, awayScore);</w:t>
+          <w:sz w:val="18"/>
+        </w:rPr>
+        <w:t>SettlementStrategy strategy = strategies.get(marketType);</w:t>
+      </w:r>
+    </w:p>
+    <w:p>
+      <w:pPr>
+        <w:pStyle w:val="Normal"/>
+        <w:rPr/>
+      </w:pPr>
+      <w:r>
+        <w:rPr>
+          <w:rFonts w:ascii="Courier New" w:hAnsi="Courier New"/>
+          <w:sz w:val="18"/>
+        </w:rPr>
+        <w:t xml:space="preserve">    </w:t>
+      </w:r>
+      <w:r>
+        <w:rPr>
+          <w:rFonts w:ascii="Courier New" w:hAnsi="Courier New"/>
+          <w:sz w:val="18"/>
+        </w:rPr>
+        <w:t>if (strategy == null)</w:t>
+      </w:r>
+    </w:p>
+    <w:p>
+      <w:pPr>
+        <w:pStyle w:val="Normal"/>
+        <w:rPr/>
+      </w:pPr>
+      <w:r>
+        <w:rPr>
+          <w:rFonts w:ascii="Courier New" w:hAnsi="Courier New"/>
+          <w:sz w:val="18"/>
+        </w:rPr>
+        <w:t xml:space="preserve">        </w:t>
+      </w:r>
+      <w:r>
+        <w:rPr>
+          <w:rFonts w:ascii="Courier New" w:hAnsi="Courier New"/>
+          <w:sz w:val="18"/>
+        </w:rPr>
+        <w:t>throw new IllegalArgumentException("No strategy registered for: " + marketType);</w:t>
+      </w:r>
+    </w:p>
+    <w:p>
+      <w:pPr>
+        <w:pStyle w:val="Normal"/>
+        <w:rPr/>
+      </w:pPr>
+      <w:r>
+        <w:rPr>
+          <w:rFonts w:ascii="Courier New" w:hAnsi="Courier New"/>
+          <w:sz w:val="18"/>
+        </w:rPr>
+        <w:t xml:space="preserve">    </w:t>
+      </w:r>
+      <w:r>
+        <w:rPr>
+          <w:rFonts w:ascii="Courier New" w:hAnsi="Courier New"/>
+          <w:sz w:val="18"/>
+        </w:rPr>
+        <w:t>long eid    = eventRepo.nextId();</w:t>
+      </w:r>
+    </w:p>
+    <w:p>
+      <w:pPr>
+        <w:pStyle w:val="Normal"/>
+        <w:rPr/>
+      </w:pPr>
+      <w:r>
+        <w:rPr>
+          <w:rFonts w:ascii="Courier New" w:hAnsi="Courier New"/>
+          <w:sz w:val="18"/>
+        </w:rPr>
+        <w:t xml:space="preserve">    </w:t>
+      </w:r>
+      <w:r>
+        <w:rPr>
+          <w:rFonts w:ascii="Courier New" w:hAnsi="Courier New"/>
+          <w:sz w:val="18"/>
+        </w:rPr>
+        <w:t>Event event = new Event(eid, homeTeam, awayTeam, kickOff, league, marketType, strategy);</w:t>
+      </w:r>
+    </w:p>
+    <w:p>
+      <w:pPr>
+        <w:pStyle w:val="Normal"/>
+        <w:rPr/>
+      </w:pPr>
+      <w:r>
+        <w:rPr>
+          <w:rFonts w:ascii="Courier New" w:hAnsi="Courier New"/>
+          <w:sz w:val="18"/>
+        </w:rPr>
+        <w:t xml:space="preserve">    </w:t>
+      </w:r>
+      <w:r>
+        <w:rPr>
+          <w:rFonts w:ascii="Courier New" w:hAnsi="Courier New"/>
+          <w:sz w:val="18"/>
+        </w:rPr>
+        <w:t>eventRepo.save(eid, event);</w:t>
+      </w:r>
+    </w:p>
+    <w:p>
+      <w:pPr>
+        <w:pStyle w:val="Normal"/>
+        <w:rPr/>
+      </w:pPr>
+      <w:r>
+        <w:rPr>
+          <w:rFonts w:ascii="Courier New" w:hAnsi="Courier New"/>
+          <w:sz w:val="18"/>
+        </w:rPr>
+        <w:t xml:space="preserve">    </w:t>
+      </w:r>
+      <w:r>
+        <w:rPr>
+          <w:rFonts w:ascii="Courier New" w:hAnsi="Courier New"/>
+          <w:sz w:val="18"/>
+        </w:rPr>
+        <w:t>return event;</w:t>
+      </w:r>
+    </w:p>
+    <w:p>
+      <w:pPr>
+        <w:pStyle w:val="Normal"/>
+        <w:rPr/>
+      </w:pPr>
+      <w:r>
+        <w:rPr>
+          <w:rFonts w:ascii="Courier New" w:hAnsi="Courier New"/>
+          <w:sz w:val="18"/>
+        </w:rPr>
+        <w:t>}</w:t>
+      </w:r>
+    </w:p>
+    <w:p>
+      <w:pPr>
+        <w:pStyle w:val="Normal"/>
+        <w:rPr/>
+      </w:pPr>
+      <w:r>
+        <w:rPr/>
+      </w:r>
+    </w:p>
+    <w:p>
+      <w:pPr>
+        <w:pStyle w:val="Normal"/>
+        <w:rPr/>
+      </w:pPr>
+      <w:r>
+        <w:rPr>
+          <w:rFonts w:ascii="Courier New" w:hAnsi="Courier New"/>
+          <w:sz w:val="18"/>
+        </w:rPr>
+        <w:t>Exchange.processResult then just delegates:</w:t>
+      </w:r>
+    </w:p>
+    <w:p>
+      <w:pPr>
+        <w:pStyle w:val="Normal"/>
+        <w:rPr/>
+      </w:pPr>
+      <w:r>
+        <w:rPr/>
+      </w:r>
+    </w:p>
+    <w:p>
+      <w:pPr>
+        <w:pStyle w:val="Normal"/>
+        <w:rPr/>
+      </w:pPr>
+      <w:r>
+        <w:rPr>
+          <w:rFonts w:ascii="Courier New" w:hAnsi="Courier New"/>
+          <w:sz w:val="18"/>
+        </w:rPr>
+        <w:t>public void processResult(AdminUser admin, Long eventId, int homeScore, int awayScore)</w:t>
+      </w:r>
+    </w:p>
+    <w:p>
+      <w:pPr>
+        <w:pStyle w:val="Normal"/>
+        <w:rPr/>
+      </w:pPr>
+      <w:r>
+        <w:rPr>
+          <w:rFonts w:ascii="Courier New" w:hAnsi="Courier New"/>
+          <w:sz w:val="18"/>
+        </w:rPr>
+        <w:t xml:space="preserve">        </w:t>
+      </w:r>
+      <w:r>
+        <w:rPr>
+          <w:rFonts w:ascii="Courier New" w:hAnsi="Courier New"/>
+          <w:sz w:val="18"/>
+        </w:rPr>
+        <w:t>throws ExchangeException {</w:t>
+      </w:r>
+    </w:p>
+    <w:p>
+      <w:pPr>
+        <w:pStyle w:val="Normal"/>
+        <w:rPr/>
+      </w:pPr>
+      <w:r>
+        <w:rPr>
+          <w:rFonts w:ascii="Courier New" w:hAnsi="Courier New"/>
+          <w:sz w:val="18"/>
+        </w:rPr>
+        <w:t xml:space="preserve">    </w:t>
+      </w:r>
+      <w:r>
+        <w:rPr>
+          <w:rFonts w:ascii="Courier New" w:hAnsi="Courier New"/>
+          <w:sz w:val="18"/>
+        </w:rPr>
+        <w:t>Objects.requireNonNull(admin, "Admin reference required");</w:t>
+      </w:r>
+    </w:p>
+    <w:p>
+      <w:pPr>
+        <w:pStyle w:val="Normal"/>
+        <w:rPr/>
+      </w:pPr>
+      <w:r>
+        <w:rPr>
+          <w:rFonts w:ascii="Courier New" w:hAnsi="Courier New"/>
+          <w:sz w:val="18"/>
+        </w:rPr>
+        <w:t xml:space="preserve">    </w:t>
+      </w:r>
+      <w:r>
+        <w:rPr>
+          <w:rFonts w:ascii="Courier New" w:hAnsi="Courier New"/>
+          <w:sz w:val="18"/>
+        </w:rPr>
+        <w:t>Event event = requireEvent(eventId);</w:t>
+      </w:r>
+    </w:p>
+    <w:p>
+      <w:pPr>
+        <w:pStyle w:val="Normal"/>
+        <w:rPr/>
+      </w:pPr>
+      <w:r>
+        <w:rPr>
+          <w:rFonts w:ascii="Courier New" w:hAnsi="Courier New"/>
+          <w:sz w:val="18"/>
+        </w:rPr>
+        <w:t xml:space="preserve">    </w:t>
+      </w:r>
+      <w:r>
+        <w:rPr>
+          <w:rFonts w:ascii="Courier New" w:hAnsi="Courier New"/>
+          <w:sz w:val="18"/>
+        </w:rPr>
+        <w:t>event.processResult(homeScore, awayScore);</w:t>
+      </w:r>
+    </w:p>
+    <w:p>
+      <w:pPr>
+        <w:pStyle w:val="Normal"/>
+        <w:rPr/>
+      </w:pPr>
+      <w:r>
+        <w:rPr>
+          <w:rFonts w:ascii="Courier New" w:hAnsi="Courier New"/>
+          <w:sz w:val="18"/>
+        </w:rPr>
+        <w:t>}</w:t>
+      </w:r>
+    </w:p>
+    <w:p>
+      <w:pPr>
+        <w:pStyle w:val="Normal"/>
+        <w:spacing w:before="0" w:after="120"/>
+        <w:rPr/>
+      </w:pPr>
+      <w:r>
+        <w:rPr>
+          <w:b w:val="false"/>
+          <w:sz w:val="22"/>
+        </w:rPr>
+        <w:t>This is the Strategy pattern and a clear case of the Open/Closed Principle. To add an "Asian handicap" market type, write a new class implementing SettlementStrategy, call registerStrategy(MarketType.ASIAN_HANDICAP, new AsianHandicapStrategy()), and every new event with that market type automatically gets the right strategy — zero changes to Event, Exchange.processResult, or any existing strategy.</w:t>
+      </w:r>
+    </w:p>
+    <w:p>
+      <w:pPr>
+        <w:pStyle w:val="Normal"/>
+        <w:spacing w:before="0" w:after="120"/>
+        <w:rPr/>
+      </w:pPr>
+      <w:r>
+        <w:rPr>
+          <w:b w:val="false"/>
+          <w:sz w:val="22"/>
+        </w:rPr>
+        <w:t>The call this.strategy.determineWinner(homeScore, awayScore) inside Event looks identical regardless of which concrete strategy was injected. The compiler sees the abstract interface type; the JVM resolves the override at runtime. This is inclusion polymorphism — dynamic dispatch on an interface reference — used directly by Event, with no involvement from Exchange at settlement time.</w:t>
+      </w:r>
+    </w:p>
+    <w:p>
+      <w:pPr>
+        <w:pStyle w:val="Heading3"/>
+        <w:rPr/>
+      </w:pPr>
+      <w:r>
+        <w:rPr>
+          <w:color w:val="000000"/>
+          <w:sz w:val="24"/>
+        </w:rPr>
+        <w:t>6b.iv UI Role Dispatch via getRoleName()</w:t>
+      </w:r>
+    </w:p>
+    <w:p>
+      <w:pPr>
+        <w:pStyle w:val="Normal"/>
+        <w:spacing w:before="0" w:after="120"/>
+        <w:rPr/>
+      </w:pPr>
+      <w:r>
+        <w:rPr>
+          <w:b w:val="false"/>
+          <w:sz w:val="22"/>
+        </w:rPr>
+        <w:t>The Swing main window decides which tabs to show based on the logged-in user's role. It does this without any instanceof checks. The same User reference, which holds either a StandardUser or an AdminUser at runtime, answers getRoleName() differently:</w:t>
       </w:r>
     </w:p>
     <w:p>
@@ -5074,14 +5501,7 @@
           <w:rFonts w:ascii="Courier New" w:hAnsi="Courier New"/>
           <w:sz w:val="17"/>
         </w:rPr>
-        <w:t xml:space="preserve">    </w:t>
-      </w:r>
-      <w:r>
-        <w:rPr>
-          <w:rFonts w:ascii="Courier New" w:hAnsi="Courier New"/>
-          <w:sz w:val="17"/>
-        </w:rPr>
-        <w:t>this.status    = EventStatus.COMPLETED;</w:t>
+        <w:t>String role = currentUser.getRoleName();   // virtual dispatch</w:t>
       </w:r>
     </w:p>
     <w:p>
@@ -5097,21 +5517,7 @@
           <w:rFonts w:ascii="Courier New" w:hAnsi="Courier New"/>
           <w:sz w:val="17"/>
         </w:rPr>
-        <w:t>}</w:t>
-      </w:r>
-    </w:p>
-    <w:p>
-      <w:pPr>
-        <w:pStyle w:val="Normal"/>
-        <w:spacing w:before="0" w:after="120"/>
-        <w:rPr/>
-      </w:pPr>
-      <w:r>
-        <w:rPr>
-          <w:b w:val="false"/>
-          <w:sz w:val="22"/>
-        </w:rPr>
-        <w:t>And Exchange.processResult selects the strategy:</w:t>
+        <w:t>tabs.addTab("Markets",     new MarketsPanel(exchange, currentUser));</w:t>
       </w:r>
     </w:p>
     <w:p>
@@ -5127,7 +5533,7 @@
           <w:rFonts w:ascii="Courier New" w:hAnsi="Courier New"/>
           <w:sz w:val="17"/>
         </w:rPr>
-        <w:t>public void processResult(AdminUser admin, Long eventId, int homeScore, int awayScore)</w:t>
+        <w:t>tabs.addTab("My Activity", new ActivityPanel(exchange, currentUser));</w:t>
       </w:r>
     </w:p>
     <w:p>
@@ -5143,14 +5549,7 @@
           <w:rFonts w:ascii="Courier New" w:hAnsi="Courier New"/>
           <w:sz w:val="17"/>
         </w:rPr>
-        <w:t xml:space="preserve">        </w:t>
-      </w:r>
-      <w:r>
-        <w:rPr>
-          <w:rFonts w:ascii="Courier New" w:hAnsi="Courier New"/>
-          <w:sz w:val="17"/>
-        </w:rPr>
-        <w:t>throws ExchangeException {</w:t>
+        <w:t>if ("PLAYER".equals(role)) {</w:t>
       </w:r>
     </w:p>
     <w:p>
@@ -5173,7 +5572,7 @@
           <w:rFonts w:ascii="Courier New" w:hAnsi="Courier New"/>
           <w:sz w:val="17"/>
         </w:rPr>
-        <w:t>Event event = requireEvent(eventId);</w:t>
+        <w:t>tabs.addTab("Wallet", new WalletPanel(exchange, (Tradeable) currentUser));</w:t>
       </w:r>
     </w:p>
     <w:p>
@@ -5189,14 +5588,7 @@
           <w:rFonts w:ascii="Courier New" w:hAnsi="Courier New"/>
           <w:sz w:val="17"/>
         </w:rPr>
-        <w:t xml:space="preserve">    </w:t>
-      </w:r>
-      <w:r>
-        <w:rPr>
-          <w:rFonts w:ascii="Courier New" w:hAnsi="Courier New"/>
-          <w:sz w:val="17"/>
-        </w:rPr>
-        <w:t>SettlementStrategy strategy = strategies.getOrDefault(</w:t>
+        <w:t>}</w:t>
       </w:r>
     </w:p>
     <w:p>
@@ -5212,14 +5604,7 @@
           <w:rFonts w:ascii="Courier New" w:hAnsi="Courier New"/>
           <w:sz w:val="17"/>
         </w:rPr>
-        <w:t xml:space="preserve">            </w:t>
-      </w:r>
-      <w:r>
-        <w:rPr>
-          <w:rFonts w:ascii="Courier New" w:hAnsi="Courier New"/>
-          <w:sz w:val="17"/>
-        </w:rPr>
-        <w:t>event.getMarketType(), new ThreeWaySettlementStrategy());</w:t>
+        <w:t>if ("ADMIN".equals(role)) {</w:t>
       </w:r>
     </w:p>
     <w:p>
@@ -5242,7 +5627,7 @@
           <w:rFonts w:ascii="Courier New" w:hAnsi="Courier New"/>
           <w:sz w:val="17"/>
         </w:rPr>
-        <w:t>event.processResult(homeScore, awayScore, strategy);</w:t>
+        <w:t>tabs.addTab("Admin", new AdminPanel(exchange, (AdminUser) currentUser));</w:t>
       </w:r>
     </w:p>
     <w:p>
@@ -5272,9 +5657,9 @@
         <w:rPr/>
         <w:drawing>
           <wp:inline distT="0" distB="0" distL="0" distR="0">
-            <wp:extent cx="5029200" cy="1125855"/>
+            <wp:extent cx="5029200" cy="1828165"/>
             <wp:effectExtent l="0" t="0" r="0" b="0"/>
-            <wp:docPr id="7" name="Picture 8" descr=""/>
+            <wp:docPr id="7" name="Picture 9" descr=""/>
             <wp:cNvGraphicFramePr>
               <a:graphicFrameLocks xmlns:a="http://schemas.openxmlformats.org/drawingml/2006/main" noChangeAspect="1"/>
             </wp:cNvGraphicFramePr>
@@ -5282,312 +5667,13 @@
               <a:graphicData uri="http://schemas.openxmlformats.org/drawingml/2006/picture">
                 <pic:pic xmlns:pic="http://schemas.openxmlformats.org/drawingml/2006/picture">
                   <pic:nvPicPr>
-                    <pic:cNvPr id="7" name="Picture 8" descr=""/>
+                    <pic:cNvPr id="7" name="Picture 9" descr=""/>
                     <pic:cNvPicPr>
                       <a:picLocks noChangeAspect="1" noChangeArrowheads="1"/>
                     </pic:cNvPicPr>
                   </pic:nvPicPr>
                   <pic:blipFill>
                     <a:blip r:embed="rId8"/>
-                    <a:stretch>
-                      <a:fillRect/>
-                    </a:stretch>
-                  </pic:blipFill>
-                  <pic:spPr bwMode="auto">
-                    <a:xfrm>
-                      <a:off x="0" y="0"/>
-                      <a:ext cx="5029200" cy="1125855"/>
-                    </a:xfrm>
-                    <a:prstGeom prst="rect">
-                      <a:avLst/>
-                    </a:prstGeom>
-                  </pic:spPr>
-                </pic:pic>
-              </a:graphicData>
-            </a:graphic>
-          </wp:inline>
-        </w:drawing>
-      </w:r>
-    </w:p>
-    <w:p>
-      <w:pPr>
-        <w:pStyle w:val="Normal"/>
-        <w:spacing w:before="0" w:after="120"/>
-        <w:rPr/>
-      </w:pPr>
-      <w:r>
-        <w:rPr>
-          <w:b w:val="false"/>
-          <w:sz w:val="22"/>
-        </w:rPr>
-        <w:t xml:space="preserve">This is the </w:t>
-      </w:r>
-      <w:r>
-        <w:rPr>
-          <w:b/>
-          <w:sz w:val="22"/>
-        </w:rPr>
-        <w:t>Strategy pattern</w:t>
-      </w:r>
-      <w:r>
-        <w:rPr>
-          <w:b w:val="false"/>
-          <w:sz w:val="22"/>
-        </w:rPr>
-        <w:t xml:space="preserve"> and a clear case of the </w:t>
-      </w:r>
-      <w:r>
-        <w:rPr>
-          <w:b/>
-          <w:sz w:val="22"/>
-        </w:rPr>
-        <w:t>Open/Closed Principle</w:t>
-      </w:r>
-      <w:r>
-        <w:rPr>
-          <w:b w:val="false"/>
-          <w:sz w:val="22"/>
-        </w:rPr>
-        <w:t>. To add an "Asian handicap" market type, write a new class implementing SettlementStrategy and register it in the strategy map. Event does not change. Neither does Exchange.processResult. The polymorphic dispatch absorbs the new behaviour.</w:t>
-      </w:r>
-    </w:p>
-    <w:p>
-      <w:pPr>
-        <w:pStyle w:val="Normal"/>
-        <w:spacing w:before="0" w:after="120"/>
-        <w:rPr/>
-      </w:pPr>
-      <w:r>
-        <w:rPr>
-          <w:b w:val="false"/>
-          <w:sz w:val="22"/>
-        </w:rPr>
-        <w:t>The call strategy.determineWinner(...) looks identical regardless of which concrete strategy is bound. The JVM checks the runtime type and dispatches to the correct override. The compiler sees only the interface.</w:t>
-      </w:r>
-    </w:p>
-    <w:p>
-      <w:pPr>
-        <w:pStyle w:val="Heading3"/>
-        <w:rPr/>
-      </w:pPr>
-      <w:r>
-        <w:rPr>
-          <w:color w:val="000000"/>
-          <w:sz w:val="24"/>
-        </w:rPr>
-        <w:t>6b.iv UI Role Dispatch via getRoleName()</w:t>
-      </w:r>
-    </w:p>
-    <w:p>
-      <w:pPr>
-        <w:pStyle w:val="Normal"/>
-        <w:spacing w:before="0" w:after="120"/>
-        <w:rPr/>
-      </w:pPr>
-      <w:r>
-        <w:rPr>
-          <w:b w:val="false"/>
-          <w:sz w:val="22"/>
-        </w:rPr>
-        <w:t>The Swing main window decides which tabs to show based on the logged-in user's role. It does this without any instanceof checks. The same User reference, which holds either a StandardUser or an AdminUser at runtime, answers getRoleName() differently:</w:t>
-      </w:r>
-    </w:p>
-    <w:p>
-      <w:pPr>
-        <w:pStyle w:val="Normal"/>
-        <w:shd w:val="clear" w:color="auto" w:fill="F2F2F2"/>
-        <w:spacing w:before="0" w:after="0"/>
-        <w:ind w:left="432"/>
-        <w:rPr/>
-      </w:pPr>
-      <w:r>
-        <w:rPr>
-          <w:rFonts w:ascii="Courier New" w:hAnsi="Courier New"/>
-          <w:sz w:val="17"/>
-        </w:rPr>
-        <w:t>String role = currentUser.getRoleName();   // virtual dispatch</w:t>
-      </w:r>
-    </w:p>
-    <w:p>
-      <w:pPr>
-        <w:pStyle w:val="Normal"/>
-        <w:shd w:val="clear" w:color="auto" w:fill="F2F2F2"/>
-        <w:spacing w:before="0" w:after="0"/>
-        <w:ind w:left="432"/>
-        <w:rPr/>
-      </w:pPr>
-      <w:r>
-        <w:rPr>
-          <w:rFonts w:ascii="Courier New" w:hAnsi="Courier New"/>
-          <w:sz w:val="17"/>
-        </w:rPr>
-        <w:t>tabs.addTab("Markets",     new MarketsPanel(exchange, currentUser));</w:t>
-      </w:r>
-    </w:p>
-    <w:p>
-      <w:pPr>
-        <w:pStyle w:val="Normal"/>
-        <w:shd w:val="clear" w:color="auto" w:fill="F2F2F2"/>
-        <w:spacing w:before="0" w:after="0"/>
-        <w:ind w:left="432"/>
-        <w:rPr/>
-      </w:pPr>
-      <w:r>
-        <w:rPr>
-          <w:rFonts w:ascii="Courier New" w:hAnsi="Courier New"/>
-          <w:sz w:val="17"/>
-        </w:rPr>
-        <w:t>tabs.addTab("My Activity", new ActivityPanel(exchange, currentUser));</w:t>
-      </w:r>
-      <w:r>
-        <w:rPr>
-          <w:rFonts w:ascii="Courier New" w:hAnsi="Courier New"/>
-          <w:sz w:val="17"/>
-        </w:rPr>
-      </w:r>
-    </w:p>
-    <w:p>
-      <w:pPr>
-        <w:pStyle w:val="Normal"/>
-        <w:shd w:val="clear" w:color="auto" w:fill="F2F2F2"/>
-        <w:spacing w:before="0" w:after="0"/>
-        <w:ind w:left="432"/>
-        <w:rPr/>
-      </w:pPr>
-      <w:r>
-        <w:rPr>
-          <w:rFonts w:ascii="Courier New" w:hAnsi="Courier New"/>
-          <w:sz w:val="17"/>
-        </w:rPr>
-        <w:t>if ("PLAYER".equals(role)) {</w:t>
-      </w:r>
-      <w:r>
-        <w:rPr>
-          <w:rFonts w:ascii="Courier New" w:hAnsi="Courier New"/>
-          <w:sz w:val="17"/>
-        </w:rPr>
-      </w:r>
-    </w:p>
-    <w:p>
-      <w:pPr>
-        <w:pStyle w:val="Normal"/>
-        <w:shd w:val="clear" w:color="auto" w:fill="F2F2F2"/>
-        <w:spacing w:before="0" w:after="0"/>
-        <w:ind w:left="432"/>
-        <w:rPr/>
-      </w:pPr>
-      <w:r>
-        <w:rPr>
-          <w:rFonts w:ascii="Courier New" w:hAnsi="Courier New"/>
-          <w:sz w:val="17"/>
-        </w:rPr>
-        <w:t xml:space="preserve">    tabs.addTab("Wallet", new WalletPanel(exchange, (Tradeable) currentUser));</w:t>
-      </w:r>
-      <w:r>
-        <w:rPr>
-          <w:rFonts w:ascii="Courier New" w:hAnsi="Courier New"/>
-          <w:sz w:val="17"/>
-        </w:rPr>
-      </w:r>
-    </w:p>
-    <w:p>
-      <w:pPr>
-        <w:pStyle w:val="Normal"/>
-        <w:shd w:val="clear" w:color="auto" w:fill="F2F2F2"/>
-        <w:spacing w:before="0" w:after="0"/>
-        <w:ind w:left="432"/>
-        <w:rPr/>
-      </w:pPr>
-      <w:r>
-        <w:rPr>
-          <w:rFonts w:ascii="Courier New" w:hAnsi="Courier New"/>
-          <w:sz w:val="17"/>
-        </w:rPr>
-        <w:t>}</w:t>
-      </w:r>
-    </w:p>
-    <w:p>
-      <w:pPr>
-        <w:pStyle w:val="Normal"/>
-        <w:shd w:val="clear" w:color="auto" w:fill="F2F2F2"/>
-        <w:spacing w:before="0" w:after="0"/>
-        <w:ind w:left="432"/>
-        <w:rPr/>
-      </w:pPr>
-      <w:r>
-        <w:rPr>
-          <w:rFonts w:ascii="Courier New" w:hAnsi="Courier New"/>
-          <w:sz w:val="17"/>
-        </w:rPr>
-        <w:t>if ("ADMIN".equals(role)) {</w:t>
-      </w:r>
-      <w:r>
-        <w:rPr>
-          <w:rFonts w:ascii="Courier New" w:hAnsi="Courier New"/>
-          <w:sz w:val="17"/>
-        </w:rPr>
-      </w:r>
-    </w:p>
-    <w:p>
-      <w:pPr>
-        <w:pStyle w:val="Normal"/>
-        <w:shd w:val="clear" w:color="auto" w:fill="F2F2F2"/>
-        <w:spacing w:before="0" w:after="0"/>
-        <w:ind w:left="432"/>
-        <w:rPr/>
-      </w:pPr>
-      <w:r>
-        <w:rPr>
-          <w:rFonts w:ascii="Courier New" w:hAnsi="Courier New"/>
-          <w:sz w:val="17"/>
-        </w:rPr>
-        <w:t xml:space="preserve">    tabs.addTab("Admin", new AdminPanel(exchange, (AdminUser) currentUser));</w:t>
-      </w:r>
-    </w:p>
-    <w:p>
-      <w:pPr>
-        <w:pStyle w:val="Normal"/>
-        <w:shd w:val="clear" w:color="auto" w:fill="F2F2F2"/>
-        <w:spacing w:before="0" w:after="0"/>
-        <w:ind w:left="432"/>
-        <w:rPr/>
-      </w:pPr>
-      <w:r>
-        <w:rPr>
-          <w:rFonts w:ascii="Courier New" w:hAnsi="Courier New"/>
-          <w:sz w:val="17"/>
-        </w:rPr>
-        <w:t xml:space="preserve">}</w:t>
-      </w:r>
-    </w:p>
-    <w:p>
-      <w:pPr>
-        <w:pStyle w:val="Normal"/>
-        <w:spacing w:before="120" w:after="120"/>
-        <w:jc w:val="center"/>
-        <w:rPr/>
-      </w:pPr>
-      <w:r>
-        <w:rPr/>
-        <w:drawing>
-          <wp:inline distT="0" distB="0" distL="0" distR="0">
-            <wp:extent cx="5029200" cy="1828165"/>
-            <wp:effectExtent l="0" t="0" r="0" b="0"/>
-            <wp:docPr id="8" name="Picture 9" descr=""/>
-            <wp:cNvGraphicFramePr>
-              <a:graphicFrameLocks xmlns:a="http://schemas.openxmlformats.org/drawingml/2006/main" noChangeAspect="1"/>
-            </wp:cNvGraphicFramePr>
-            <a:graphic xmlns:a="http://schemas.openxmlformats.org/drawingml/2006/main">
-              <a:graphicData uri="http://schemas.openxmlformats.org/drawingml/2006/picture">
-                <pic:pic xmlns:pic="http://schemas.openxmlformats.org/drawingml/2006/picture">
-                  <pic:nvPicPr>
-                    <pic:cNvPr id="8" name="Picture 9" descr=""/>
-                    <pic:cNvPicPr>
-                      <a:picLocks noChangeAspect="1" noChangeArrowheads="1"/>
-                    </pic:cNvPicPr>
-                  </pic:nvPicPr>
-                  <pic:blipFill>
-                    <a:blip r:embed="rId9"/>
                     <a:stretch>
                       <a:fillRect/>
                     </a:stretch>
@@ -5738,7 +5824,7 @@
       </w:pPr>
       <w:r>
         <w:rPr/>
-        <w:t>Parametric polymorphism allows a single class or interface definition to operate over many types, with the type fixed at each use site and the compiler enforcing correctness at every interaction.</w:t>
+        <w:t>Parametric polymorphism allows a single class or interface definition to operate over many types, with the type fixed at each use site and the compiler enforcing correctness at every interaction. The codebase has one designed generic abstraction — GenericRepository&lt;T&gt; — and several uses of parameterised standard-library types.</w:t>
       </w:r>
     </w:p>
     <w:p>
@@ -5748,45 +5834,21 @@
       </w:pPr>
       <w:r>
         <w:rPr/>
-        <w:t>Money implements Comparable&lt;Money&gt;</w:t>
-      </w:r>
-    </w:p>
-    <w:p>
-      <w:pPr>
-        <w:pStyle w:val="Normal"/>
-        <w:rPr/>
-      </w:pPr>
-      <w:r>
-        <w:rPr/>
-        <w:t>Comparable&lt;T&gt; is a parameterised interface from the Java standard library. By implementing it with T = Money, the compareTo method only accepts another Money — not an arbitrary Object:</w:t>
-      </w:r>
-    </w:p>
-    <w:p>
-      <w:pPr>
-        <w:pStyle w:val="Normal"/>
-        <w:rPr/>
-      </w:pPr>
-      <w:r>
-        <w:rPr/>
-      </w:r>
-    </w:p>
-    <w:p>
-      <w:pPr>
-        <w:pStyle w:val="Normal"/>
-        <w:rPr/>
-      </w:pPr>
-      <w:r>
-        <w:rPr/>
-      </w:r>
-    </w:p>
-    <w:p>
-      <w:pPr>
-        <w:pStyle w:val="Normal"/>
-        <w:rPr/>
-      </w:pPr>
-      <w:r>
-        <w:rPr/>
-        <w:t>public final class Money implements Comparable&lt;Money&gt; {</w:t>
+        <w:t>GenericRepository&lt;T&gt;</w:t>
+      </w:r>
+    </w:p>
+    <w:p>
+      <w:pPr>
+        <w:pStyle w:val="Normal"/>
+        <w:rPr/>
+      </w:pPr>
+      <w:r>
+        <w:rPr/>
+        <w:t xml:space="preserve"> </w:t>
+      </w:r>
+      <w:r>
+        <w:rPr/>
+        <w:t>Exchange holds four GenericRepository&lt;T&gt; instances — one per domain aggregate:</w:t>
       </w:r>
     </w:p>
     <w:p>
@@ -5795,25 +5857,17 @@
         <w:shd w:val="clear" w:color="auto" w:fill="F2F2F2"/>
         <w:spacing w:before="0" w:after="0"/>
         <w:ind w:left="432"/>
-        <w:rPr/>
-      </w:pPr>
-      <w:r>
-        <w:rPr/>
-        <w:t xml:space="preserve">   </w:t>
-      </w:r>
-      <w:r>
-        <w:rPr>
-          <w:rFonts w:ascii="Courier New" w:hAnsi="Courier New"/>
-          <w:sz w:val="17"/>
-        </w:rPr>
-        <w:t xml:space="preserve"> </w:t>
-      </w:r>
-      <w:r>
-        <w:rPr>
-          <w:rFonts w:ascii="Courier New" w:hAnsi="Courier New"/>
-          <w:sz w:val="17"/>
-        </w:rPr>
-        <w:t>@Override</w:t>
+        <w:rPr>
+          <w:rFonts w:ascii="Courier New" w:hAnsi="Courier New"/>
+          <w:sz w:val="17"/>
+        </w:rPr>
+      </w:pPr>
+      <w:r>
+        <w:rPr>
+          <w:rFonts w:ascii="Courier New" w:hAnsi="Courier New"/>
+          <w:sz w:val="17"/>
+        </w:rPr>
+        <w:t>private final GenericRepository&lt;User&gt;  userRepo  = new GenericRepository&lt;&gt;();</w:t>
       </w:r>
     </w:p>
     <w:p>
@@ -5832,14 +5886,7 @@
           <w:rFonts w:ascii="Courier New" w:hAnsi="Courier New"/>
           <w:sz w:val="17"/>
         </w:rPr>
-        <w:t xml:space="preserve">    </w:t>
-      </w:r>
-      <w:r>
-        <w:rPr>
-          <w:rFonts w:ascii="Courier New" w:hAnsi="Courier New"/>
-          <w:sz w:val="17"/>
-        </w:rPr>
-        <w:t>public int compareTo(Money other) {</w:t>
+        <w:t>private final GenericRepository&lt;Event&gt; eventRepo = new GenericRepository&lt;&gt;();</w:t>
       </w:r>
     </w:p>
     <w:p>
@@ -5858,14 +5905,7 @@
           <w:rFonts w:ascii="Courier New" w:hAnsi="Courier New"/>
           <w:sz w:val="17"/>
         </w:rPr>
-        <w:t xml:space="preserve">        </w:t>
-      </w:r>
-      <w:r>
-        <w:rPr>
-          <w:rFonts w:ascii="Courier New" w:hAnsi="Courier New"/>
-          <w:sz w:val="17"/>
-        </w:rPr>
-        <w:t>return this.value.compareTo(other.value);</w:t>
+        <w:t>private final GenericRepository&lt;Offer&gt; offerRepo = new GenericRepository&lt;&gt;();</w:t>
       </w:r>
     </w:p>
     <w:p>
@@ -5884,12 +5924,164 @@
           <w:rFonts w:ascii="Courier New" w:hAnsi="Courier New"/>
           <w:sz w:val="17"/>
         </w:rPr>
+        <w:t>private final GenericRepository&lt;Bet&gt;   betRepo   = new GenericRepository&lt;&gt;();</w:t>
+      </w:r>
+    </w:p>
+    <w:p>
+      <w:pPr>
+        <w:pStyle w:val="Normal"/>
+        <w:rPr/>
+      </w:pPr>
+      <w:r>
+        <w:rPr>
+          <w:rFonts w:ascii="Courier New" w:hAnsi="Courier New"/>
+          <w:sz w:val="18"/>
+        </w:rPr>
+        <w:t>public class GenericRepository&lt;T&gt; {</w:t>
+      </w:r>
+    </w:p>
+    <w:p>
+      <w:pPr>
+        <w:pStyle w:val="Normal"/>
+        <w:rPr/>
+      </w:pPr>
+      <w:r>
+        <w:rPr>
+          <w:rFonts w:ascii="Courier New" w:hAnsi="Courier New"/>
+          <w:sz w:val="18"/>
+        </w:rPr>
         <w:t xml:space="preserve">    </w:t>
       </w:r>
       <w:r>
         <w:rPr>
           <w:rFonts w:ascii="Courier New" w:hAnsi="Courier New"/>
-          <w:sz w:val="17"/>
+          <w:sz w:val="18"/>
+        </w:rPr>
+        <w:t>private final Map&lt;Long, T&gt; store = new HashMap&lt;&gt;();</w:t>
+      </w:r>
+    </w:p>
+    <w:p>
+      <w:pPr>
+        <w:pStyle w:val="Normal"/>
+        <w:rPr/>
+      </w:pPr>
+      <w:r>
+        <w:rPr>
+          <w:rFonts w:ascii="Courier New" w:hAnsi="Courier New"/>
+          <w:sz w:val="18"/>
+        </w:rPr>
+        <w:t xml:space="preserve">    </w:t>
+      </w:r>
+      <w:r>
+        <w:rPr>
+          <w:rFonts w:ascii="Courier New" w:hAnsi="Courier New"/>
+          <w:sz w:val="18"/>
+        </w:rPr>
+        <w:t>private long seq = 1;</w:t>
+      </w:r>
+    </w:p>
+    <w:p>
+      <w:pPr>
+        <w:pStyle w:val="Normal"/>
+        <w:rPr/>
+      </w:pPr>
+      <w:r>
+        <w:rPr>
+          <w:rFonts w:ascii="Courier New" w:hAnsi="Courier New"/>
+          <w:sz w:val="18"/>
+        </w:rPr>
+        <w:t xml:space="preserve">    </w:t>
+      </w:r>
+      <w:r>
+        <w:rPr>
+          <w:rFonts w:ascii="Courier New" w:hAnsi="Courier New"/>
+          <w:sz w:val="18"/>
+        </w:rPr>
+        <w:t>public long nextId() { return seq++; }</w:t>
+      </w:r>
+    </w:p>
+    <w:p>
+      <w:pPr>
+        <w:pStyle w:val="Normal"/>
+        <w:rPr/>
+      </w:pPr>
+      <w:r>
+        <w:rPr>
+          <w:rFonts w:ascii="Courier New" w:hAnsi="Courier New"/>
+          <w:sz w:val="18"/>
+        </w:rPr>
+        <w:t xml:space="preserve">    </w:t>
+      </w:r>
+      <w:r>
+        <w:rPr>
+          <w:rFonts w:ascii="Courier New" w:hAnsi="Courier New"/>
+          <w:sz w:val="18"/>
+        </w:rPr>
+        <w:t>public void save(Long id, T entity)  { store.put(id, entity); }</w:t>
+      </w:r>
+    </w:p>
+    <w:p>
+      <w:pPr>
+        <w:pStyle w:val="Normal"/>
+        <w:rPr/>
+      </w:pPr>
+      <w:r>
+        <w:rPr>
+          <w:rFonts w:ascii="Courier New" w:hAnsi="Courier New"/>
+          <w:sz w:val="18"/>
+        </w:rPr>
+        <w:t xml:space="preserve">   </w:t>
+      </w:r>
+      <w:r>
+        <w:rPr>
+          <w:rFonts w:ascii="Courier New" w:hAnsi="Courier New"/>
+          <w:sz w:val="18"/>
+        </w:rPr>
+        <w:t>public Optional&lt;T&gt; findById(Long id) { return Optional.ofNullable(store.get(id)); }</w:t>
+      </w:r>
+    </w:p>
+    <w:p>
+      <w:pPr>
+        <w:pStyle w:val="Normal"/>
+        <w:rPr/>
+      </w:pPr>
+      <w:r>
+        <w:rPr>
+          <w:rFonts w:ascii="Courier New" w:hAnsi="Courier New"/>
+          <w:sz w:val="18"/>
+        </w:rPr>
+        <w:t xml:space="preserve">    </w:t>
+      </w:r>
+      <w:r>
+        <w:rPr>
+          <w:rFonts w:ascii="Courier New" w:hAnsi="Courier New"/>
+          <w:sz w:val="18"/>
+        </w:rPr>
+        <w:t xml:space="preserve">public List&lt;T&gt; findAll()             </w:t>
+      </w:r>
+    </w:p>
+    <w:p>
+      <w:pPr>
+        <w:pStyle w:val="Normal"/>
+        <w:rPr/>
+      </w:pPr>
+      <w:r>
+        <w:rPr>
+          <w:rFonts w:ascii="Courier New" w:hAnsi="Courier New"/>
+          <w:sz w:val="18"/>
+        </w:rPr>
+        <w:t>{ return new ArrayList&lt;&gt;(store.values()); }</w:t>
+      </w:r>
+    </w:p>
+    <w:p>
+      <w:pPr>
+        <w:pStyle w:val="Normal"/>
+        <w:rPr/>
+      </w:pPr>
+      <w:r>
+        <w:rPr>
+          <w:rFonts w:ascii="Courier New" w:hAnsi="Courier New"/>
+          <w:sz w:val="18"/>
         </w:rPr>
         <w:t>}</w:t>
       </w:r>
@@ -5897,165 +6089,21 @@
     <w:p>
       <w:pPr>
         <w:pStyle w:val="Normal"/>
-        <w:shd w:val="clear" w:color="auto" w:fill="F2F2F2"/>
-        <w:spacing w:before="0" w:after="0"/>
-        <w:ind w:left="432"/>
-        <w:rPr>
-          <w:rFonts w:ascii="Courier New" w:hAnsi="Courier New"/>
-          <w:sz w:val="17"/>
-        </w:rPr>
-      </w:pPr>
-      <w:r>
-        <w:rPr>
-          <w:rFonts w:ascii="Courier New" w:hAnsi="Courier New"/>
-          <w:sz w:val="17"/>
-        </w:rPr>
-        <w:t>}</w:t>
-      </w:r>
-    </w:p>
-    <w:p>
-      <w:pPr>
-        <w:pStyle w:val="Normal"/>
-        <w:rPr/>
-      </w:pPr>
-      <w:r>
-        <w:rPr/>
-        <w:t>The type parameter pins what counts as a valid comparison. The compiler rejects money.compareTo("100") at compile time. Money is accepted anywhere a sorted or ranked element is expected — Collections.sort, TreeMap, or any generic algorithm bounded by Comparable&lt;T&gt;.</w:t>
-      </w:r>
-    </w:p>
-    <w:p>
-      <w:pPr>
-        <w:pStyle w:val="Heading3"/>
-        <w:rPr/>
-      </w:pPr>
-      <w:r>
-        <w:rPr/>
-        <w:t>Typed collections in Exchange</w:t>
-      </w:r>
-    </w:p>
-    <w:p>
-      <w:pPr>
-        <w:pStyle w:val="Normal"/>
-        <w:rPr/>
-      </w:pPr>
-      <w:r>
-        <w:rPr/>
-        <w:t>Exchange stores every domain aggregate in a typed map:</w:t>
-      </w:r>
-    </w:p>
-    <w:p>
-      <w:pPr>
-        <w:pStyle w:val="Normal"/>
-        <w:shd w:val="clear" w:color="auto" w:fill="F2F2F2"/>
-        <w:spacing w:before="0" w:after="0"/>
-        <w:ind w:left="432"/>
-        <w:rPr>
-          <w:rFonts w:ascii="Courier New" w:hAnsi="Courier New"/>
-          <w:sz w:val="17"/>
-        </w:rPr>
-      </w:pPr>
-      <w:r>
-        <w:rPr>
-          <w:rFonts w:ascii="Courier New" w:hAnsi="Courier New"/>
-          <w:sz w:val="17"/>
-        </w:rPr>
-        <w:t>private final Map&lt;Long, User&gt;   users   = new HashMap&lt;&gt;();</w:t>
-      </w:r>
-    </w:p>
-    <w:p>
-      <w:pPr>
-        <w:pStyle w:val="Normal"/>
-        <w:shd w:val="clear" w:color="auto" w:fill="F2F2F2"/>
-        <w:spacing w:before="0" w:after="0"/>
-        <w:ind w:left="432"/>
-        <w:rPr>
-          <w:rFonts w:ascii="Courier New" w:hAnsi="Courier New"/>
-          <w:sz w:val="17"/>
-        </w:rPr>
-      </w:pPr>
-      <w:r>
-        <w:rPr>
-          <w:rFonts w:ascii="Courier New" w:hAnsi="Courier New"/>
-          <w:sz w:val="17"/>
-        </w:rPr>
-        <w:t>private final Map&lt;Long, Wallet&gt; wallets = new HashMap&lt;&gt;();</w:t>
-      </w:r>
-    </w:p>
-    <w:p>
-      <w:pPr>
-        <w:pStyle w:val="Normal"/>
-        <w:shd w:val="clear" w:color="auto" w:fill="F2F2F2"/>
-        <w:spacing w:before="0" w:after="0"/>
-        <w:ind w:left="432"/>
-        <w:rPr>
-          <w:rFonts w:ascii="Courier New" w:hAnsi="Courier New"/>
-          <w:sz w:val="17"/>
-        </w:rPr>
-      </w:pPr>
-      <w:r>
-        <w:rPr>
-          <w:rFonts w:ascii="Courier New" w:hAnsi="Courier New"/>
-          <w:sz w:val="17"/>
-        </w:rPr>
-        <w:t>private final Map&lt;Long, Event&gt;  events  = new HashMap&lt;&gt;();</w:t>
-      </w:r>
-    </w:p>
-    <w:p>
-      <w:pPr>
-        <w:pStyle w:val="Normal"/>
-        <w:shd w:val="clear" w:color="auto" w:fill="F2F2F2"/>
-        <w:spacing w:before="0" w:after="0"/>
-        <w:ind w:left="432"/>
-        <w:rPr>
-          <w:rFonts w:ascii="Courier New" w:hAnsi="Courier New"/>
-          <w:sz w:val="17"/>
-        </w:rPr>
-      </w:pPr>
-      <w:r>
-        <w:rPr>
-          <w:rFonts w:ascii="Courier New" w:hAnsi="Courier New"/>
-          <w:sz w:val="17"/>
-        </w:rPr>
-        <w:t>private final Map&lt;Long, Offer&gt;  offers  = new HashMap&lt;&gt;();</w:t>
-      </w:r>
-    </w:p>
-    <w:p>
-      <w:pPr>
-        <w:pStyle w:val="Normal"/>
-        <w:shd w:val="clear" w:color="auto" w:fill="F2F2F2"/>
-        <w:spacing w:before="0" w:after="0"/>
-        <w:ind w:left="432"/>
-        <w:rPr>
-          <w:rFonts w:ascii="Courier New" w:hAnsi="Courier New"/>
-          <w:sz w:val="17"/>
-        </w:rPr>
-      </w:pPr>
-      <w:r>
-        <w:rPr>
-          <w:rFonts w:ascii="Courier New" w:hAnsi="Courier New"/>
-          <w:sz w:val="17"/>
-        </w:rPr>
-        <w:t>private final Map&lt;Long, Bet&gt;    bets    = new HashMap&lt;&gt;();</w:t>
-      </w:r>
-    </w:p>
-    <w:p>
-      <w:pPr>
-        <w:pStyle w:val="Normal"/>
-        <w:rPr/>
-      </w:pPr>
-      <w:r>
-        <w:rPr/>
-        <w:t>The same Map class body handles five different value types. The compiler rejects users.put(id, wallet) — a Wallet cannot enter a Map&lt;Long, User&gt;. Without parametric polymorphism, five separate untyped maps would be required, with runtime casts at every lookup.</w:t>
-      </w:r>
-    </w:p>
-    <w:p>
-      <w:pPr>
-        <w:pStyle w:val="Normal"/>
-        <w:rPr/>
-      </w:pPr>
-      <w:r>
-        <w:rPr/>
-        <w:t>Event and Offer use parameterised lists for the same reason: List&lt;Offer&gt; in Event and List&lt;Bet&gt; in Offer.</w:t>
+        <w:rPr/>
+      </w:pPr>
+      <w:r>
+        <w:rPr/>
+        <w:t>GenericRepository&lt;T&gt; is defined once. Exchange binds T to User, Event, Offer, and Bet at each declaration site. The compiler ensures userRepo.save(id, wallet) is rejected — a Wallet cannot enter a GenericRepository&lt;User&gt;. The store : Map&lt;Long, T&gt; field inside GenericRepository itself uses a typed map, so parametric polymorphism is applied at two levels: once in the class definition and once at each instantiation.</w:t>
+      </w:r>
+    </w:p>
+    <w:p>
+      <w:pPr>
+        <w:pStyle w:val="Normal"/>
+        <w:rPr/>
+      </w:pPr>
+      <w:r>
+        <w:rPr/>
+        <w:t>Event and Offer use parameterised lists for the same reason: List&lt;Offer&gt; in Event and List&lt;Bet&gt; in Offer. Money implements Comparable&lt;Money&gt; so that compareTo only accepts another Money — not an arbitrary Object.</w:t>
       </w:r>
     </w:p>
     <w:p>
@@ -6075,7 +6123,7 @@
       </w:pPr>
       <w:r>
         <w:rPr/>
-        <w:t>You write Map&lt;Long, User&gt; once and the compiler becomes your gatekeeper. users.get(id) returns a User, not an Object. A type mismatch on insert is caught at the call site, not buried inside a ClassCastException at runtime.</w:t>
+        <w:t>You write GenericRepository&lt;T&gt; once. At each use site you bind T — the compiler then becomes your gatekeeper for every interaction with that repository. userRepo.findAll() returns List&lt;User&gt;, not a raw list. A type mismatch on insert is caught at the call site, not buried inside a ClassCastException at runtime.</w:t>
       </w:r>
     </w:p>
     <w:p>
@@ -6095,7 +6143,53 @@
       </w:pPr>
       <w:r>
         <w:rPr/>
-        <w:t>As a caller of Exchange, you receive typed results. getAllUsers() returns List&lt;User&gt; — not a raw list. You iterate and call u.getRoleName() immediately with no casting or guessing about the collection's contents.</w:t>
+        <w:t>As a caller of Exchange, you receive typed results. getAllUsers() returns List&lt;User&gt; — not a raw list. You iterate and call u.getRoleName() immediately with no casting or guessing. getAllEvents() returns List&lt;Event&gt;. The same guarantee holds for offers and bets. The generic contract enforces this correctness at every call site without any runtime overhead.</w:t>
+      </w:r>
+    </w:p>
+    <w:p>
+      <w:pPr>
+        <w:pStyle w:val="Normal"/>
+        <w:rPr/>
+      </w:pPr>
+      <w:r>
+        <w:rPr/>
+        <w:drawing>
+          <wp:inline distT="0" distB="0" distL="0" distR="0">
+            <wp:extent cx="4536440" cy="2413000"/>
+            <wp:effectExtent l="0" t="0" r="0" b="0"/>
+            <wp:docPr id="8" name="new_image_genrepo.png" descr=""/>
+            <wp:cNvGraphicFramePr>
+              <a:graphicFrameLocks xmlns:a="http://schemas.openxmlformats.org/drawingml/2006/main" noChangeAspect="1"/>
+            </wp:cNvGraphicFramePr>
+            <a:graphic xmlns:a="http://schemas.openxmlformats.org/drawingml/2006/main">
+              <a:graphicData uri="http://schemas.openxmlformats.org/drawingml/2006/picture">
+                <pic:pic xmlns:pic="http://schemas.openxmlformats.org/drawingml/2006/picture">
+                  <pic:nvPicPr>
+                    <pic:cNvPr id="8" name="new_image_genrepo.png" descr=""/>
+                    <pic:cNvPicPr>
+                      <a:picLocks noChangeAspect="1" noChangeArrowheads="1"/>
+                    </pic:cNvPicPr>
+                  </pic:nvPicPr>
+                  <pic:blipFill>
+                    <a:blip r:embed="rId9"/>
+                    <a:stretch>
+                      <a:fillRect/>
+                    </a:stretch>
+                  </pic:blipFill>
+                  <pic:spPr bwMode="auto">
+                    <a:xfrm>
+                      <a:off x="0" y="0"/>
+                      <a:ext cx="4536440" cy="2413000"/>
+                    </a:xfrm>
+                    <a:prstGeom prst="rect">
+                      <a:avLst/>
+                    </a:prstGeom>
+                  </pic:spPr>
+                </pic:pic>
+              </a:graphicData>
+            </a:graphic>
+          </wp:inline>
+        </w:drawing>
       </w:r>
     </w:p>
     <w:p>
@@ -7183,7 +7277,7 @@
         <w:rPr/>
         <w:drawing>
           <wp:inline distT="0" distB="0" distL="0" distR="0">
-            <wp:extent cx="5029200" cy="1159510"/>
+            <wp:extent cx="4634865" cy="1159510"/>
             <wp:effectExtent l="0" t="0" r="0" b="0"/>
             <wp:docPr id="13" name="Picture 15" descr=""/>
             <wp:cNvGraphicFramePr>
@@ -7207,7 +7301,7 @@
                   <pic:spPr bwMode="auto">
                     <a:xfrm>
                       <a:off x="0" y="0"/>
-                      <a:ext cx="5029200" cy="1159510"/>
+                      <a:ext cx="4634865" cy="1159510"/>
                     </a:xfrm>
                     <a:prstGeom prst="rect">
                       <a:avLst/>
@@ -7433,7 +7527,7 @@
           <w:b w:val="false"/>
           <w:sz w:val="22"/>
         </w:rPr>
-        <w:t>This single-entry design keeps every business operation in one auditable place. It is also the anchor for the polymorphism patterns above: login returns User, deposit/withdraw accept Tradeable, and processResult picks the right SettlementStrategy from its registry.</w:t>
+        <w:t>This single-entry design keeps every business operation in one auditable place. It is also the anchor for the polymorphism patterns above: login returns User (inclusion polymorphism), deposit/withdraw accept Tradeable (DIP + ISP), and processResult delegates to the strategy the Event already holds — strategy resolution is done once at addEvent time, not at settlement time.</w:t>
       </w:r>
     </w:p>
     <w:p>
@@ -7810,6 +7904,7 @@
     <w:p>
       <w:pPr>
         <w:pStyle w:val="Heading2"/>
+        <w:spacing w:before="0" w:after="0"/>
         <w:rPr/>
       </w:pPr>
       <w:r>

</xml_diff>